<commit_message>
docs: checkpoint M4 report and process materials in progress
</commit_message>
<xml_diff>
--- a/docs/design/m4-midterm-report.docx
+++ b/docs/design/m4-midterm-report.docx
@@ -27,7 +27,7 @@
     </w:p>
     <w:p>
       <w:r>
-        <w:t>版本：v0.2，待成员复核；实现基准：main@ffb2657（2026-10-21）。</w:t>
+        <w:t>版本：v0.3，待成员复核；实现基准：main@ffb2657（2026-10-21）。</w:t>
       </w:r>
     </w:p>
     <w:p>
@@ -40,12 +40,12 @@
     </w:p>
     <w:p>
       <w:r>
-        <w:t>本项目开发基于 LoCoMo 长期对话的动态记忆 Web 应用。系统从原始对话提取结构化 Memory，检索与问题相关的历史，再结合时间及状态关系选择有效证据并回答。例如，先住 Paris、后搬到 Rome 的人，当前与搬家前的住所问题应使用不同来源，旧事实仍可追溯。</w:t>
+        <w:t>本项目开发基于 LoCoMo 长期对话的动态记忆 Web 应用。系统从原始对话提取结构化 Memory，检索与问题相关的历史，再结合时间及状态关系选择有效证据并回答。本阶段主要呈现需求规格、系统设计、已实现功能与初步测试。〔1〕 〔2〕</w:t>
       </w:r>
     </w:p>
     <w:p>
       <w:r>
-        <w:t>依据助教说明，本阶段呈现需求规格、系统设计、已实现功能与初步测试。M3/M4 规格见 Issue #4 的仓库副本；后续评测及质量调整由 ADR 和执行记录补充，历史规格保留原文。[1][2]</w:t>
+        <w:t>正式 M3 文档引用：待填写。下表 FR 编号按组员 v0.2 待复核稿暂作对应，待正式稿确认。</w:t>
       </w:r>
     </w:p>
     <w:tbl>
@@ -55,14 +55,15 @@
         <w:tblLook w:firstColumn="1" w:firstRow="1" w:lastColumn="0" w:lastRow="0" w:noHBand="0" w:noVBand="1" w:val="04A0"/>
       </w:tblPr>
       <w:tblGrid>
-        <w:gridCol w:w="3213"/>
-        <w:gridCol w:w="3213"/>
-        <w:gridCol w:w="3213"/>
+        <w:gridCol w:w="2409"/>
+        <w:gridCol w:w="2409"/>
+        <w:gridCol w:w="2409"/>
+        <w:gridCol w:w="2409"/>
       </w:tblGrid>
       <w:tr>
         <w:tc>
           <w:tcPr>
-            <w:tcW w:type="dxa" w:w="3213"/>
+            <w:tcW w:type="dxa" w:w="2409"/>
           </w:tcPr>
           <w:p>
             <w:r>
@@ -72,7 +73,17 @@
         </w:tc>
         <w:tc>
           <w:tcPr>
-            <w:tcW w:type="dxa" w:w="3213"/>
+            <w:tcW w:type="dxa" w:w="2409"/>
+          </w:tcPr>
+          <w:p>
+            <w:r>
+              <w:t>对应 M3 需求</w:t>
+            </w:r>
+          </w:p>
+        </w:tc>
+        <w:tc>
+          <w:tcPr>
+            <w:tcW w:type="dxa" w:w="2409"/>
           </w:tcPr>
           <w:p>
             <w:r>
@@ -82,7 +93,7 @@
         </w:tc>
         <w:tc>
           <w:tcPr>
-            <w:tcW w:type="dxa" w:w="3213"/>
+            <w:tcW w:type="dxa" w:w="2409"/>
           </w:tcPr>
           <w:p>
             <w:r>
@@ -94,7 +105,7 @@
       <w:tr>
         <w:tc>
           <w:tcPr>
-            <w:tcW w:type="dxa" w:w="3213"/>
+            <w:tcW w:type="dxa" w:w="2409"/>
           </w:tcPr>
           <w:p>
             <w:r>
@@ -104,7 +115,17 @@
         </w:tc>
         <w:tc>
           <w:tcPr>
-            <w:tcW w:type="dxa" w:w="3213"/>
+            <w:tcW w:type="dxa" w:w="2409"/>
+          </w:tcPr>
+          <w:p>
+            <w:r>
+              <w:t>FR01</w:t>
+            </w:r>
+          </w:p>
+        </w:tc>
+        <w:tc>
+          <w:tcPr>
+            <w:tcW w:type="dxa" w:w="2409"/>
           </w:tcPr>
           <w:p>
             <w:r>
@@ -114,7 +135,7 @@
         </w:tc>
         <w:tc>
           <w:tcPr>
-            <w:tcW w:type="dxa" w:w="3213"/>
+            <w:tcW w:type="dxa" w:w="2409"/>
           </w:tcPr>
           <w:p>
             <w:r>
@@ -126,7 +147,7 @@
       <w:tr>
         <w:tc>
           <w:tcPr>
-            <w:tcW w:type="dxa" w:w="3213"/>
+            <w:tcW w:type="dxa" w:w="2409"/>
           </w:tcPr>
           <w:p>
             <w:r>
@@ -136,21 +157,31 @@
         </w:tc>
         <w:tc>
           <w:tcPr>
-            <w:tcW w:type="dxa" w:w="3213"/>
+            <w:tcW w:type="dxa" w:w="2409"/>
           </w:tcPr>
           <w:p>
             <w:r>
-              <w:t>抽取独立陈述并关联一个或多个来源</w:t>
+              <w:t>FR02；恢复、发布关联 FR03/05</w:t>
             </w:r>
           </w:p>
         </w:tc>
         <w:tc>
           <w:tcPr>
-            <w:tcW w:type="dxa" w:w="3213"/>
+            <w:tcW w:type="dxa" w:w="2409"/>
           </w:tcPr>
           <w:p>
             <w:r>
-              <w:t>检查内容、时间、事件／状态、事实／计划及否定信息</w:t>
+              <w:t>抽取独立陈述并关联来源</w:t>
+            </w:r>
+          </w:p>
+        </w:tc>
+        <w:tc>
+          <w:tcPr>
+            <w:tcW w:type="dxa" w:w="2409"/>
+          </w:tcPr>
+          <w:p>
+            <w:r>
+              <w:t>核查内容、时间、性质、否定与来源；检查恢复及完整发布</w:t>
             </w:r>
           </w:p>
         </w:tc>
@@ -158,7 +189,7 @@
       <w:tr>
         <w:tc>
           <w:tcPr>
-            <w:tcW w:type="dxa" w:w="3213"/>
+            <w:tcW w:type="dxa" w:w="2409"/>
           </w:tcPr>
           <w:p>
             <w:r>
@@ -168,7 +199,17 @@
         </w:tc>
         <w:tc>
           <w:tcPr>
-            <w:tcW w:type="dxa" w:w="3213"/>
+            <w:tcW w:type="dxa" w:w="2409"/>
+          </w:tcPr>
+          <w:p>
+            <w:r>
+              <w:t>FR04</w:t>
+            </w:r>
+          </w:p>
+        </w:tc>
+        <w:tc>
+          <w:tcPr>
+            <w:tcW w:type="dxa" w:w="2409"/>
           </w:tcPr>
           <w:p>
             <w:r>
@@ -178,7 +219,7 @@
         </w:tc>
         <w:tc>
           <w:tcPr>
-            <w:tcW w:type="dxa" w:w="3213"/>
+            <w:tcW w:type="dxa" w:w="2409"/>
           </w:tcPr>
           <w:p>
             <w:r>
@@ -190,7 +231,7 @@
       <w:tr>
         <w:tc>
           <w:tcPr>
-            <w:tcW w:type="dxa" w:w="3213"/>
+            <w:tcW w:type="dxa" w:w="2409"/>
           </w:tcPr>
           <w:p>
             <w:r>
@@ -200,17 +241,27 @@
         </w:tc>
         <w:tc>
           <w:tcPr>
-            <w:tcW w:type="dxa" w:w="3213"/>
+            <w:tcW w:type="dxa" w:w="2409"/>
           </w:tcPr>
           <w:p>
             <w:r>
-              <w:t>分析问题，融合关键词和向量排名</w:t>
+              <w:t>FR06/07</w:t>
             </w:r>
           </w:p>
         </w:tc>
         <w:tc>
           <w:tcPr>
-            <w:tcW w:type="dxa" w:w="3213"/>
+            <w:tcW w:type="dxa" w:w="2409"/>
+          </w:tcPr>
+          <w:p>
+            <w:r>
+              <w:t>分析问题，融合排名并扩展历史</w:t>
+            </w:r>
+          </w:p>
+        </w:tc>
+        <w:tc>
+          <w:tcPr>
+            <w:tcW w:type="dxa" w:w="2409"/>
           </w:tcPr>
           <w:p>
             <w:r>
@@ -222,7 +273,7 @@
       <w:tr>
         <w:tc>
           <w:tcPr>
-            <w:tcW w:type="dxa" w:w="3213"/>
+            <w:tcW w:type="dxa" w:w="2409"/>
           </w:tcPr>
           <w:p>
             <w:r>
@@ -232,21 +283,31 @@
         </w:tc>
         <w:tc>
           <w:tcPr>
-            <w:tcW w:type="dxa" w:w="3213"/>
+            <w:tcW w:type="dxa" w:w="2409"/>
           </w:tcPr>
           <w:p>
             <w:r>
-              <w:t>根据人物、状态维度和时间选择记忆</w:t>
+              <w:t>FR08；兜底关联 FR12</w:t>
             </w:r>
           </w:p>
         </w:tc>
         <w:tc>
           <w:tcPr>
-            <w:tcW w:type="dxa" w:w="3213"/>
+            <w:tcW w:type="dxa" w:w="2409"/>
           </w:tcPr>
           <w:p>
             <w:r>
-              <w:t>当前与历史问题采用对应证据；冲突和证据不足分别说明</w:t>
+              <w:t>按人物、状态维度和时间选择记忆</w:t>
+            </w:r>
+          </w:p>
+        </w:tc>
+        <w:tc>
+          <w:tcPr>
+            <w:tcW w:type="dxa" w:w="2409"/>
+          </w:tcPr>
+          <w:p>
+            <w:r>
+              <w:t>当前与历史问题采用对应证据；冲突和不足分别说明</w:t>
             </w:r>
           </w:p>
         </w:tc>
@@ -254,7 +315,7 @@
       <w:tr>
         <w:tc>
           <w:tcPr>
-            <w:tcW w:type="dxa" w:w="3213"/>
+            <w:tcW w:type="dxa" w:w="2409"/>
           </w:tcPr>
           <w:p>
             <w:r>
@@ -264,21 +325,31 @@
         </w:tc>
         <w:tc>
           <w:tcPr>
-            <w:tcW w:type="dxa" w:w="3213"/>
+            <w:tcW w:type="dxa" w:w="2409"/>
           </w:tcPr>
           <w:p>
             <w:r>
-              <w:t>展示答案、来源、历史关系及 Trace</w:t>
+              <w:t>FR08/09</w:t>
             </w:r>
           </w:p>
         </w:tc>
         <w:tc>
           <w:tcPr>
-            <w:tcW w:type="dxa" w:w="3213"/>
+            <w:tcW w:type="dxa" w:w="2409"/>
           </w:tcPr>
           <w:p>
             <w:r>
-              <w:t>完成导入到问答的核心操作，能够读取保存结果和导出 JSON</w:t>
+              <w:t>展示答案、来源、历史及 Trace</w:t>
+            </w:r>
+          </w:p>
+        </w:tc>
+        <w:tc>
+          <w:tcPr>
+            <w:tcW w:type="dxa" w:w="2409"/>
+          </w:tcPr>
+          <w:p>
+            <w:r>
+              <w:t>完成核心操作并读取已有结果，核查引用与处理过程</w:t>
             </w:r>
           </w:p>
         </w:tc>
@@ -286,12 +357,17 @@
     </w:tbl>
     <w:p>
       <w:r>
-        <w:t>共同约束：QA 标准答案不进入构建或线上问答；查询固定一个完整版本，不修改全局状态；模型失败、未完成构建与证据不足分别记录；配置和来源可追溯，凭据不进入报告、Trace 或导出。首版采用英文提问与英文证据，中文界面，部署范围为本地单用户应用。[1][2]</w:t>
+        <w:t>已接入的补充能力包括 JSON 导出（FR10）与独立评测（FR11），分别检查导出版本一致性和评测记录的可追溯性。</w:t>
       </w:r>
     </w:p>
     <w:p>
       <w:r>
-        <w:t>仓库保存官方 10 段对话、5,882 轮与 1,986 条 QA。当前完成核心应用和一轮 conv-26 开发集展示；开发对话为 conv-26/30/41/42，本地留出为 conv-43/44，教师隐藏评分集另行保密。本轮结果不代表全开发集或独立测试结果。[2][3]</w:t>
+        <w:t>共同约束：QA 标准答案不进入构建或线上问答；查询固定一个完整版本，不修改全局状态；模型失败、未完成构建与证据不足分别记录；配置和来源可追溯，凭据不进入报告、Trace 或导出。首版采用英文提问与英文证据，中文界面，部署范围为本地单用户应用。〔1〕 〔2〕</w:t>
+      </w:r>
+    </w:p>
+    <w:p>
+      <w:r>
+        <w:t>仓库保存官方 10 段对话、5,882 轮与 1,986 条 QA。当前完成核心应用和一轮 conv-26 开发集展示；开发对话为 conv-26/30/41/42，本地留出为 conv-43/44，教师隐藏评分集另行保密。本轮结果不代表全开发集或独立测试结果。〔2〕 〔3〕</w:t>
       </w:r>
     </w:p>
     <w:p>
@@ -309,7 +385,7 @@
     </w:p>
     <w:p>
       <w:r>
-        <w:t>应用采用 Streamlit → FastAPI → 业务模块 → SQLite／检索索引的调用路径。页面只负责交互和展示，持久化、校验及状态变更由后端统一处理。SQLite 适合课程数据规模，生成模型和 Embedding 通过适配层接入，无须独立图数据库或向量数据库。[2]</w:t>
+        <w:t>应用采用 Streamlit → FastAPI → 业务模块 → SQLite／检索索引的调用路径。页面只负责交互和展示，持久化、校验及状态变更由后端统一处理。SQLite 适合课程数据规模，生成模型和 Embedding 通过适配层接入，无须独立图数据库或向量数据库。〔2〕</w:t>
       </w:r>
     </w:p>
     <w:p>
@@ -525,7 +601,7 @@
     </w:p>
     <w:p>
       <w:r>
-        <w:t>原始会话时间、原始时间表达与推导日期分别保存，未知时间不强行精确化。“现在”以所选对话最后一次会话为已知截止时间；明确历史日期优先，未来计划不作为已发生事实。仅 conversation 作为构建来源，QA 和官方辅助摘要独立保存。[1][2]</w:t>
+        <w:t>原始会话时间、原始时间表达与推导日期分别保存，未知时间不强行精确化。“现在”以所选对话最后一次会话为已知截止时间；明确历史日期优先，未来计划不作为已发生事实。仅 conversation 作为构建来源，QA 和官方辅助摘要独立保存。〔1〕 〔2〕</w:t>
       </w:r>
     </w:p>
     <w:p>
@@ -551,12 +627,12 @@
     </w:p>
     <w:p>
       <w:r>
-        <w:t>导入与来源检查 → 分片抽取 → 来源和结构校验 → 建立索引 → 历史关系判断 → 状态投影 → 完整版本发布。构建阶段保存片段和关系任务的成功、失败及中断结果，显式重试复用成功产物。新版本检查通过后才整体切换；失败保留旧完整版本，首次未完成构建只允许检查。[4]</w:t>
+        <w:t>导入与来源检查 → 分片抽取 → 来源和结构校验 → 建立索引 → 历史关系判断 → 状态投影 → 完整版本发布。构建阶段保存片段和关系任务的成功、失败及中断结果，显式重试复用成功产物。新版本检查通过后才整体切换；失败保留旧完整版本，首次未完成构建只允许检查。〔4〕</w:t>
       </w:r>
     </w:p>
     <w:p>
       <w:r>
-        <w:t>关系区分 RETAIN、UPDATE、SUPERSEDE、CONFLICT 和 undetermined。历史事件与旧状态保留，计划不直接替代事实，时间较新也不能单独证明替代。当前展示复用已发布 conv-26 完整 Build，含 272 条 Memory 和 4,902 条关系；本轮未重新抽取或修改该 Build。[3][5]</w:t>
+        <w:t>关系区分 RETAIN、UPDATE、SUPERSEDE、CONFLICT 和 undetermined。历史事件与旧状态保留，计划不直接替代事实，时间较新也不能单独证明替代。当前展示复用已发布 conv-26 完整 Build，含 272 条 Memory 和 4,902 条关系；本轮未重新抽取或修改该 Build。〔3〕 〔5〕</w:t>
       </w:r>
     </w:p>
     <w:p>
@@ -574,12 +650,12 @@
     </w:p>
     <w:p>
       <w:r>
-        <w:t>在线页面提供 Dynamic 与 Dynamic + 原文兜底。后者在证据缺口时至多进行一次有界原文补查并联合解析，原文来自固定 Build 的来源，不产生新 Memory。必要冲突端点和既有支持受到保护；结构化解析失败可走既有原文备用路径，Trace 记录实际执行策略。查询补判不写回全局关系或状态。[4]</w:t>
+        <w:t>在线页面提供 Dynamic 与 Dynamic + 原文兜底。后者在证据缺口时至多进行一次有界原文补查并联合解析，原文来自固定 Build 的来源，不产生新 Memory。必要冲突端点和既有支持受到保护；结构化解析失败可走既有原文备用路径，Trace 记录实际执行策略。查询补判不写回全局关系或状态。〔4〕</w:t>
       </w:r>
     </w:p>
     <w:p>
       <w:r>
-        <w:t>当前默认 deepseek-flash，输出上限 8192 tokens，关系阶段 high 思考、证据解析 low，其余阶段关闭思考；实验配置保存在 plan.json，不以当前默认值覆盖历史快照。MiniLM 固定 revision、384 维，检查长度并拒绝静默截断。</w:t>
+        <w:t>当前默认 deepseek-flash，输出上限 8192 tokens，关系阶段 high 思考、证据解析 low，其余阶段关闭思考。展示实验固定配置中，通用输出上限为 8192，关系阶段单独配置为 16384；设置见 plan.json，构建被复用，本轮未重跑关系。MiniLM 固定 revision、384 维，检查长度并拒绝静默截断。</w:t>
       </w:r>
     </w:p>
     <w:p>
@@ -592,12 +668,12 @@
     </w:p>
     <w:p>
       <w:r>
-        <w:t>既有 Chromium 检查已覆盖导入、故意失败与重试、发布、当前／历史／冲突／不足问答及 JSON 下载。真实结果通过生产页面和只读 API 回放保存 Trace，五项操作均通过，页面与控制台错误为零；回放不代表新发起模型请求。[5]</w:t>
+        <w:t>既有 Chromium 检查已覆盖导入、故意失败与重试、发布、当前／历史／冲突／不足问答及 JSON 下载。真实结果通过生产页面和只读 API 回放保存 Trace，五项操作均通过，页面与控制台错误为零；回放不代表新发起模型请求。〔5〕</w:t>
       </w:r>
     </w:p>
     <w:p>
       <w:r>
-        <w:t>运行环境为 WSL Ubuntu、Python 3.12 和 uv。锁定安装后，分别启动 FastAPI 与 Streamlit；真实构建另需本地 MiniLM 缓存和受保护凭据。接口包括 POST /builds、POST /queries、GET /queries/{trace_id} 和完整版本导出，详细命令见运行指南。[4]</w:t>
+        <w:t>运行环境为 WSL Ubuntu、Python 3.12 和 uv。锁定安装后，分别启动 FastAPI 与 Streamlit；真实构建另需本地 MiniLM 缓存和受保护凭据。接口包括 POST /builds、POST /queries、GET /queries/{trace_id} 和完整版本导出，详细命令见运行指南。〔4〕</w:t>
       </w:r>
     </w:p>
     <w:p>
@@ -615,12 +691,12 @@
     </w:p>
     <w:p>
       <w:r>
-        <w:t>合并前已有全量非 live 回归 405 passed、4 skipped，并保存编译和浏览器验证记录。本轮展示执行前相关测试 24 passed；受控浏览器检查退出 0。真实 MiniLM 独立检查已有 3 passed 记录。以上均为仓库既有执行结果，本次文档修订未重跑业务或付费实验。[5][6]</w:t>
+        <w:t>合并前已有全量非 live 回归 405 passed、4 skipped，并保存编译和浏览器验证记录。本轮展示执行前相关测试 24 passed；受控浏览器检查退出 0。真实 MiniLM 独立检查已有 3 passed 记录。以上均为仓库既有执行结果，本次文档修订未重跑业务或付费实验。〔5〕 〔6〕</w:t>
       </w:r>
     </w:p>
     <w:p>
       <w:r>
-        <w:t>展示实验固定 conv-26、同一完整 Build，预先分层选取五个类别各 4 题；20 题分别运行五策略，共 100 个逻辑项，全部得到合法结果。F1 按既有官方类别分支计算，仅汇总类别 1–4 的 16 题；类别 5 的 4 题单列拒答匹配，运行成功不等于语义正确。[5]</w:t>
+        <w:t>展示实验固定 conv-26、同一完整 Build，预先分层选取五个类别各 4 题；20 题分别运行五策略，共 100 个逻辑项，全部得到合法结果。F1 按既有官方类别分支计算，仅汇总类别 1–4 的 16 题；类别 5 的 4 题单列拒答匹配，运行成功不等于语义正确。〔5〕</w:t>
       </w:r>
     </w:p>
     <w:tbl>
@@ -1081,7 +1157,7 @@
     </w:tbl>
     <w:p>
       <w:r>
-        <w:t>10 个真实动态查询均成功；开发助手审阅为 9 条回答正确、1 条部分支持，存储关系另有 2 处语义异议。该审阅不是独立动态真值，不作为课程准确率。20 条回答来源审阅均引用合法，但仍有推断及部分支持；引用合法不能代替语义正确。[5]</w:t>
+        <w:t>10 个真实动态查询均成功；开发助手审阅为 9 条回答正确、1 条部分支持，存储关系另有 2 处语义异议。该审阅不是独立动态真值，不作为课程准确率。20 条回答来源审阅均引用合法，但仍有推断及部分支持；引用合法不能代替语义正确。〔5〕</w:t>
       </w:r>
     </w:p>
     <w:p>
@@ -1107,7 +1183,7 @@
     </w:p>
     <w:p>
       <w:r>
-        <w:t>QA148 的原文补查从 D18:5 找到家人对 Grand Canyon 的反应，补足原先不足的证据，展示补查的实际作用；但回答较参考长，词面 F1 仅 0.1429。QA51 仍遗漏 sunrise，QA144 答事故结局而非儿子的应对，QA68 的 Seven years 与 Since 2016 表述接近但词面分数为 0。误差同时涉及召回、证据覆盖、回答切题与计分口径，不能一概归因于检索。[5]</w:t>
+        <w:t>QA148 的原文补查从 D18:5 找到家人对 Grand Canyon 的反应，补足原先不足的证据，展示补查的实际作用；但回答较参考长，词面 F1 仅 0.1429。QA51 仍遗漏 sunrise，QA144 答事故结局而非儿子的应对，QA68 的 Seven years 与 Since 2016 表述接近但词面分数为 0。误差同时涉及召回、证据覆盖、回答切题与计分口径，不能一概归因于检索。〔5〕</w:t>
       </w:r>
     </w:p>
     <w:p>
@@ -1125,7 +1201,7 @@
     </w:p>
     <w:p>
       <w:r>
-        <w:t>本轮完成的是限定范围的开发集展示及证据审阅。原 Issue #15 已被后续增量迭代取代，757 题、四策略 3,028 项全量实验取消，Issue #20 原固定预检延期。本轮 100 项展示不替代原全量验收，也不恢复已取消计划；本地留出对话和教师隐藏评分集尚无本轮结果。[2][7]</w:t>
+        <w:t>本轮完成的是限定范围的开发集展示及证据审阅。原 Issue #15 已被后续增量迭代取代，757 题、四策略 3,028 项全量实验取消，Issue #20 原固定预检延期。本轮 100 项展示不替代原全量验收，也不恢复已取消计划；本地留出对话和教师隐藏评分集尚无本轮结果。〔2〕 〔7〕</w:t>
       </w:r>
     </w:p>
     <w:p>
@@ -1148,37 +1224,37 @@
     </w:p>
     <w:p>
       <w:r>
-        <w:t>[1] M3/M4 需求规格副本。</w:t>
+        <w:t>〔1〕 正式 M3 需求规格说明书：待填写；Issue #4 实现规格历史副本供参考。</w:t>
       </w:r>
     </w:p>
     <w:p>
       <w:r>
-        <w:t>[2] ADR 0001 架构、ADR 0002 最新评测范围。</w:t>
+        <w:t>〔2〕 ADR 0001 架构、ADR 0002 最新评测范围。</w:t>
       </w:r>
     </w:p>
     <w:p>
       <w:r>
-        <w:t>[3] 原始数据、展示固定计划。</w:t>
+        <w:t>〔3〕 原始数据、展示固定计划。</w:t>
       </w:r>
     </w:p>
     <w:p>
       <w:r>
-        <w:t>[4] 运行指南、构建与版本、有效证据问答。</w:t>
+        <w:t>〔4〕 运行指南、构建与版本、有效证据问答。</w:t>
       </w:r>
     </w:p>
     <w:p>
       <w:r>
-        <w:t>[5] 展示分析与真实页面截图、逐题指标、最终审计。</w:t>
+        <w:t>〔5〕 展示分析与真实页面截图、逐题指标、最终审计。</w:t>
       </w:r>
     </w:p>
     <w:p>
       <w:r>
-        <w:t>[6] 合并前验证、早期 MiniLM 检查。</w:t>
+        <w:t>〔6〕 合并前验证、早期 MiniLM 检查。</w:t>
       </w:r>
     </w:p>
     <w:p>
       <w:r>
-        <w:t>[7] 原全量范围结案；文档变更与页数校验另见本轮记录。</w:t>
+        <w:t>〔7〕 原全量范围结案；文档变更与页数校验另见本轮记录。</w:t>
       </w:r>
     </w:p>
     <w:sectPr>

</xml_diff>

<commit_message>
docs: finalize M4 report v0.6 and simplify process materials
</commit_message>
<xml_diff>
--- a/docs/design/m4-midterm-report.docx
+++ b/docs/design/m4-midterm-report.docx
@@ -17,7 +17,7 @@
     </w:p>
     <w:p>
       <w:r>
-        <w:t>队名：在阴雨天游泳　Team ID：3　日期：2026-10-22</w:t>
+        <w:t>队名：在阴雨天游泳　Team ID：3　日期：2026-10-23</w:t>
       </w:r>
     </w:p>
     <w:p>
@@ -27,7 +27,7 @@
     </w:p>
     <w:p>
       <w:r>
-        <w:t>版本：v0.3，待成员复核；实现基准：main@ffb2657（2026-10-21）。</w:t>
+        <w:t>版本：v0.6，待成员复核；实现基准：main@ffb2657。</w:t>
       </w:r>
     </w:p>
     <w:p>
@@ -35,17 +35,12 @@
         <w:pStyle w:val="Heading1"/>
       </w:pPr>
       <w:r>
-        <w:t>1 需求规格与阶段范围</w:t>
+        <w:t>1 需求规格</w:t>
       </w:r>
     </w:p>
     <w:p>
       <w:r>
         <w:t>本项目开发基于 LoCoMo 长期对话的动态记忆 Web 应用。系统从原始对话提取结构化 Memory，检索与问题相关的历史，再结合时间及状态关系选择有效证据并回答。本阶段主要呈现需求规格、系统设计、已实现功能与初步测试。〔1〕 〔2〕</w:t>
-      </w:r>
-    </w:p>
-    <w:p>
-      <w:r>
-        <w:t>正式 M3 文档引用：待填写。下表 FR 编号按组员 v0.2 待复核稿暂作对应，待正式稿确认。</w:t>
       </w:r>
     </w:p>
     <w:tbl>
@@ -67,7 +62,7 @@
           </w:tcPr>
           <w:p>
             <w:r>
-              <w:t>需求</w:t>
+              <w:t>用户任务</w:t>
             </w:r>
           </w:p>
         </w:tc>
@@ -77,7 +72,7 @@
           </w:tcPr>
           <w:p>
             <w:r>
-              <w:t>对应 M3 需求</w:t>
+              <w:t>核心需求与可观察结果</w:t>
             </w:r>
           </w:p>
         </w:tc>
@@ -87,7 +82,7 @@
           </w:tcPr>
           <w:p>
             <w:r>
-              <w:t>核心行为</w:t>
+              <w:t>验收方法</w:t>
             </w:r>
           </w:p>
         </w:tc>
@@ -97,7 +92,7 @@
           </w:tcPr>
           <w:p>
             <w:r>
-              <w:t>可检查的验收依据</w:t>
+              <w:t>当前实现与验证状态</w:t>
             </w:r>
           </w:p>
         </w:tc>
@@ -109,7 +104,7 @@
           </w:tcPr>
           <w:p>
             <w:r>
-              <w:t>F01 对话导入</w:t>
+              <w:t>开发者导入、构建或恢复记忆</w:t>
             </w:r>
           </w:p>
         </w:tc>
@@ -119,7 +114,7 @@
           </w:tcPr>
           <w:p>
             <w:r>
-              <w:t>FR01</w:t>
+              <w:t>原子记忆保留人物、时间、性质和来源；失败可重试，完整后发布</w:t>
             </w:r>
           </w:p>
         </w:tc>
@@ -129,7 +124,7 @@
           </w:tcPr>
           <w:p>
             <w:r>
-              <w:t>保留人物、会话、轮次、时间与原文</w:t>
+              <w:t>输入合法／非法数据；模拟中断，检查来源、重复产物与版本切换</w:t>
             </w:r>
           </w:p>
         </w:tc>
@@ -139,7 +134,7 @@
           </w:tcPr>
           <w:p>
             <w:r>
-              <w:t>按对话和 dia_id 精确定位来源；异常输入整次拒绝</w:t>
+              <w:t>已实现；工程和浏览器已有验证，真实 conv-26 Build 已发布；抽取语义未逐条独立核验</w:t>
             </w:r>
           </w:p>
         </w:tc>
@@ -151,7 +146,7 @@
           </w:tcPr>
           <w:p>
             <w:r>
-              <w:t>F02 记忆构建</w:t>
+              <w:t>复核者检查历史与状态</w:t>
             </w:r>
           </w:p>
         </w:tc>
@@ -161,7 +156,7 @@
           </w:tcPr>
           <w:p>
             <w:r>
-              <w:t>FR02；恢复、发布关联 FR03/05</w:t>
+              <w:t>旧记忆保留，关系有端点、理由与证据，当前状态可重算</w:t>
             </w:r>
           </w:p>
         </w:tc>
@@ -171,7 +166,7 @@
           </w:tcPr>
           <w:p>
             <w:r>
-              <w:t>抽取独立陈述并关联来源</w:t>
+              <w:t>对照原文检查阶段推进、替代、冲突和未知；交叉查询当前与历史</w:t>
             </w:r>
           </w:p>
         </w:tc>
@@ -181,7 +176,7 @@
           </w:tcPr>
           <w:p>
             <w:r>
-              <w:t>核查内容、时间、性质、否定与来源；检查恢复及完整发布</w:t>
+              <w:t>已实现；合成边界已检，10 个真实案例已有作者审阅，未独立复核</w:t>
             </w:r>
           </w:p>
         </w:tc>
@@ -193,7 +188,7 @@
           </w:tcPr>
           <w:p>
             <w:r>
-              <w:t>F03 历史与状态</w:t>
+              <w:t>评测者查询当前或过去</w:t>
             </w:r>
           </w:p>
         </w:tc>
@@ -203,7 +198,7 @@
           </w:tcPr>
           <w:p>
             <w:r>
-              <w:t>FR04</w:t>
+              <w:t>混合召回、扩展历史、选择有效证据，返回答案及解释</w:t>
             </w:r>
           </w:p>
         </w:tc>
@@ -213,7 +208,7 @@
           </w:tcPr>
           <w:p>
             <w:r>
-              <w:t>保留旧记忆，维护关系与当前状态</w:t>
+              <w:t>检查初始／扩展／有效集合、截止时间、回答和引用</w:t>
             </w:r>
           </w:p>
         </w:tc>
@@ -223,7 +218,7 @@
           </w:tcPr>
           <w:p>
             <w:r>
-              <w:t>展示保留、推进、替代、冲突或未确定关系及双方证据</w:t>
+              <w:t>已实现；20 题五策略和 40 题检索已运行；留出集与独立动态准确率未评</w:t>
             </w:r>
           </w:p>
         </w:tc>
@@ -235,7 +230,7 @@
           </w:tcPr>
           <w:p>
             <w:r>
-              <w:t>F04 混合检索</w:t>
+              <w:t>用户补查证据不足的问题</w:t>
             </w:r>
           </w:p>
         </w:tc>
@@ -245,7 +240,7 @@
           </w:tcPr>
           <w:p>
             <w:r>
-              <w:t>FR06/07</w:t>
+              <w:t>有界原文补查；冲突与不足分别说明，不改写记忆库</w:t>
             </w:r>
           </w:p>
         </w:tc>
@@ -255,7 +250,7 @@
           </w:tcPr>
           <w:p>
             <w:r>
-              <w:t>分析问题，融合排名并扩展历史</w:t>
+              <w:t>检查补查来源、预算、支持保留、失败回退及 Trace</w:t>
             </w:r>
           </w:p>
         </w:tc>
@@ -265,7 +260,7 @@
           </w:tcPr>
           <w:p>
             <w:r>
-              <w:t>检查初始排序、历史扩展、来源及实际预算</w:t>
+              <w:t>已实现；QA148 观察到补查收益，预算回退有记录；总体质量收益未证实</w:t>
             </w:r>
           </w:p>
         </w:tc>
@@ -277,7 +272,7 @@
           </w:tcPr>
           <w:p>
             <w:r>
-              <w:t>F05 有效证据</w:t>
+              <w:t>用户查看证据并导出 JSON</w:t>
             </w:r>
           </w:p>
         </w:tc>
@@ -287,7 +282,7 @@
           </w:tcPr>
           <w:p>
             <w:r>
-              <w:t>FR08；兜底关联 FR12</w:t>
+              <w:t>Web 展示答案、历史、Trace 与原文；导出同一完整版本</w:t>
             </w:r>
           </w:p>
         </w:tc>
@@ -297,7 +292,7 @@
           </w:tcPr>
           <w:p>
             <w:r>
-              <w:t>按人物、状态维度和时间选择记忆</w:t>
+              <w:t>展开引用、切换已有结果并下载，检查版本一致及无新生成</w:t>
             </w:r>
           </w:p>
         </w:tc>
@@ -307,7 +302,7 @@
           </w:tcPr>
           <w:p>
             <w:r>
-              <w:t>当前与历史问题采用对应证据；冲突和不足分别说明</w:t>
+              <w:t>已实现；工程、浏览器及真实结果回放已有验证；展示环境本轮尚未复测</w:t>
             </w:r>
           </w:p>
         </w:tc>
@@ -319,7 +314,7 @@
           </w:tcPr>
           <w:p>
             <w:r>
-              <w:t>F06 回答与 Web</w:t>
+              <w:t>评测者复现并比较策略</w:t>
             </w:r>
           </w:p>
         </w:tc>
@@ -329,7 +324,7 @@
           </w:tcPr>
           <w:p>
             <w:r>
-              <w:t>FR08/09</w:t>
+              <w:t>固定样本、版本与配置，记录分数、失败和用量</w:t>
             </w:r>
           </w:p>
         </w:tc>
@@ -339,7 +334,7 @@
           </w:tcPr>
           <w:p>
             <w:r>
-              <w:t>展示答案、来源、历史及 Trace</w:t>
+              <w:t>重算逐题 F1／Recall，核对请求及实际执行策略、重试与 token</w:t>
             </w:r>
           </w:p>
         </w:tc>
@@ -349,7 +344,7 @@
           </w:tcPr>
           <w:p>
             <w:r>
-              <w:t>完成核心操作并读取已有结果，核查引用与处理过程</w:t>
+              <w:t>已实现；conv-26 展示完成；跨对话评测与留出集测试尚未完成</w:t>
             </w:r>
           </w:p>
         </w:tc>
@@ -357,17 +352,7 @@
     </w:tbl>
     <w:p>
       <w:r>
-        <w:t>已接入的补充能力包括 JSON 导出（FR10）与独立评测（FR11），分别检查导出版本一致性和评测记录的可追溯性。</w:t>
-      </w:r>
-    </w:p>
-    <w:p>
-      <w:r>
-        <w:t>共同约束：QA 标准答案不进入构建或线上问答；查询固定一个完整版本，不修改全局状态；模型失败、未完成构建与证据不足分别记录；配置和来源可追溯，凭据不进入报告、Trace 或导出。首版采用英文提问与英文证据，中文界面，部署范围为本地单用户应用。〔1〕 〔2〕</w:t>
-      </w:r>
-    </w:p>
-    <w:p>
-      <w:r>
-        <w:t>仓库保存官方 10 段对话、5,882 轮与 1,986 条 QA。当前完成核心应用和一轮 conv-26 开发集展示；开发对话为 conv-26/30/41/42，本地留出为 conv-43/44，教师隐藏评分集另行保密。本轮结果不代表全开发集或独立测试结果。〔2〕 〔3〕</w:t>
+        <w:t>仅原始 conversation 进入构建，QA 与辅助标注隔离。开发对话为 conv-26/30/41/42，本地留出为 conv-43/44；当前展示仅使用 conv-26。〔2〕 〔3〕</w:t>
       </w:r>
     </w:p>
     <w:p>
@@ -380,7 +365,7 @@
         <w:pStyle w:val="Heading1"/>
       </w:pPr>
       <w:r>
-        <w:t>2 系统架构与数据设计</w:t>
+        <w:t>2 系统设计</w:t>
       </w:r>
     </w:p>
     <w:p>
@@ -426,182 +411,68 @@
     </w:p>
     <w:p>
       <w:r>
-        <w:t>图 1 系统架构。DeepSeek 用于抽取、关系判断、查询分析、证据解析及回答；MiniLM 在本地生成向量，BM25 和 RRF 提供词法召回及排名融合。</w:t>
-      </w:r>
-    </w:p>
-    <w:tbl>
-      <w:tblPr>
-        <w:tblStyle w:val="TableGrid"/>
-        <w:tblW w:type="auto" w:w="0"/>
-        <w:tblLook w:firstColumn="1" w:firstRow="1" w:lastColumn="0" w:lastRow="0" w:noHBand="0" w:noVBand="1" w:val="04A0"/>
-      </w:tblPr>
-      <w:tblGrid>
-        <w:gridCol w:w="4819"/>
-        <w:gridCol w:w="4819"/>
-      </w:tblGrid>
-      <w:tr>
-        <w:tc>
-          <w:tcPr>
-            <w:tcW w:type="dxa" w:w="4819"/>
-          </w:tcPr>
-          <w:p>
-            <w:r>
-              <w:t>对象</w:t>
-            </w:r>
-          </w:p>
-        </w:tc>
-        <w:tc>
-          <w:tcPr>
-            <w:tcW w:type="dxa" w:w="4819"/>
-          </w:tcPr>
-          <w:p>
-            <w:r>
-              <w:t>关键内容与约束</w:t>
-            </w:r>
-          </w:p>
-        </w:tc>
-      </w:tr>
-      <w:tr>
-        <w:tc>
-          <w:tcPr>
-            <w:tcW w:type="dxa" w:w="4819"/>
-          </w:tcPr>
-          <w:p>
-            <w:r>
-              <w:t>SourceTurn</w:t>
-            </w:r>
-          </w:p>
-        </w:tc>
-        <w:tc>
-          <w:tcPr>
-            <w:tcW w:type="dxa" w:w="4819"/>
-          </w:tcPr>
-          <w:p>
-            <w:r>
-              <w:t>数据集、对话、会话、轮次、说话人、时间、原文；证据身份包含对话范围</w:t>
-            </w:r>
-          </w:p>
-        </w:tc>
-      </w:tr>
-      <w:tr>
-        <w:tc>
-          <w:tcPr>
-            <w:tcW w:type="dxa" w:w="4819"/>
-          </w:tcPr>
-          <w:p>
-            <w:r>
-              <w:t>Memory</w:t>
-            </w:r>
-          </w:p>
-        </w:tc>
-        <w:tc>
-          <w:tcPr>
-            <w:tcW w:type="dxa" w:w="4819"/>
-          </w:tcPr>
-          <w:p>
-            <w:r>
-              <w:t>原子内容、实体、状态维度与值、时间、性质、来源列表和构建版本</w:t>
-            </w:r>
-          </w:p>
-        </w:tc>
-      </w:tr>
-      <w:tr>
-        <w:tc>
-          <w:tcPr>
-            <w:tcW w:type="dxa" w:w="4819"/>
-          </w:tcPr>
-          <w:p>
-            <w:r>
-              <w:t>MemoryRelation</w:t>
-            </w:r>
-          </w:p>
-        </w:tc>
-        <w:tc>
-          <w:tcPr>
-            <w:tcW w:type="dxa" w:w="4819"/>
-          </w:tcPr>
-          <w:p>
-            <w:r>
-              <w:t>新旧端点、关系标签、理由、来源和适用条件；端点与证据须通过校验</w:t>
-            </w:r>
-          </w:p>
-        </w:tc>
-      </w:tr>
-      <w:tr>
-        <w:tc>
-          <w:tcPr>
-            <w:tcW w:type="dxa" w:w="4819"/>
-          </w:tcPr>
-          <w:p>
-            <w:r>
-              <w:t>Current State</w:t>
-            </w:r>
-          </w:p>
-        </w:tc>
-        <w:tc>
-          <w:tcPr>
-            <w:tcW w:type="dxa" w:w="4819"/>
-          </w:tcPr>
-          <w:p>
-            <w:r>
-              <w:t>从历史及关系重算的当前状态投影，可保留未消解冲突</w:t>
-            </w:r>
-          </w:p>
-        </w:tc>
-      </w:tr>
-      <w:tr>
-        <w:tc>
-          <w:tcPr>
-            <w:tcW w:type="dxa" w:w="4819"/>
-          </w:tcPr>
-          <w:p>
-            <w:r>
-              <w:t>BuildVersion</w:t>
-            </w:r>
-          </w:p>
-        </w:tc>
-        <w:tc>
-          <w:tcPr>
-            <w:tcW w:type="dxa" w:w="4819"/>
-          </w:tcPr>
-          <w:p>
-            <w:r>
-              <w:t>来源、配置、Prompt/schema、模型与索引身份，区分部分产物和完整版本</w:t>
-            </w:r>
-          </w:p>
-        </w:tc>
-      </w:tr>
-      <w:tr>
-        <w:tc>
-          <w:tcPr>
-            <w:tcW w:type="dxa" w:w="4819"/>
-          </w:tcPr>
-          <w:p>
-            <w:r>
-              <w:t>QueryTrace</w:t>
-            </w:r>
-          </w:p>
-        </w:tc>
-        <w:tc>
-          <w:tcPr>
-            <w:tcW w:type="dxa" w:w="4819"/>
-          </w:tcPr>
-          <w:p>
-            <w:r>
-              <w:t>固定版本、时间条件、初始／扩展／有效集合、选择理由、引用和调用记录</w:t>
-            </w:r>
-          </w:p>
-        </w:tc>
-      </w:tr>
-    </w:tbl>
-    <w:p>
-      <w:r>
-        <w:t>一条 Memory 表达一项可独立判断的陈述，同一轮可支持多条记忆，一条记忆也可引用多轮。state_key 由对话、实体和状态维度组成，状态值另存；同键不自动意味着互斥。不同对话的同名人物隔离，事实、计划和不确定陈述区分。</w:t>
+        <w:t>图 1 模块架构。DeepSeek 完成抽取、关系判断、查询分析、证据解析与回答；MiniLM 生成本地向量，BM25 与 RRF 实现混合召回。</w:t>
       </w:r>
     </w:p>
     <w:p>
       <w:r>
-        <w:t>原始会话时间、原始时间表达与推导日期分别保存，未知时间不强行精确化。“现在”以所选对话最后一次会话为已知截止时间；明确历史日期优先，未来计划不作为已发生事实。仅 conversation 作为构建来源，QA 和官方辅助摘要独立保存。〔1〕 〔2〕</w:t>
+        <w:drawing>
+          <wp:inline xmlns:a="http://schemas.openxmlformats.org/drawingml/2006/main" xmlns:pic="http://schemas.openxmlformats.org/drawingml/2006/picture">
+            <wp:extent cx="6120000" cy="1428000"/>
+            <wp:docPr id="2" name="Picture 2"/>
+            <wp:cNvGraphicFramePr>
+              <a:graphicFrameLocks noChangeAspect="1"/>
+            </wp:cNvGraphicFramePr>
+            <a:graphic>
+              <a:graphicData uri="http://schemas.openxmlformats.org/drawingml/2006/picture">
+                <pic:pic>
+                  <pic:nvPicPr>
+                    <pic:cNvPr id="0" name="build-query-flow.png"/>
+                    <pic:cNvPicPr/>
+                  </pic:nvPicPr>
+                  <pic:blipFill>
+                    <a:blip r:embed="rId10"/>
+                    <a:stretch>
+                      <a:fillRect/>
+                    </a:stretch>
+                  </pic:blipFill>
+                  <pic:spPr>
+                    <a:xfrm>
+                      <a:off x="0" y="0"/>
+                      <a:ext cx="6120000" cy="1428000"/>
+                    </a:xfrm>
+                    <a:prstGeom prst="rect"/>
+                  </pic:spPr>
+                </pic:pic>
+              </a:graphicData>
+            </a:graphic>
+          </wp:inline>
+        </w:drawing>
+      </w:r>
+    </w:p>
+    <w:p>
+      <w:r>
+        <w:t>图 2 两条路径共享完整 Build。构建检查通过才发布并整体切换；失败保留旧完整版本。查询固定同一版本，原始问题始终参与召回，分析失败退回原问题。原文补查只读且有界，不能产生新 Memory。〔4〕</w:t>
+      </w:r>
+    </w:p>
+    <w:p>
+      <w:r>
+        <w:t>一条 Memory 表达一项可独立核查的陈述，分别保存内容、人物、状态维度、时间、性质及来源。同轮可产生多条记忆，多轮也可共同支持一条；事实、计划、否定与不确定陈述分开。state_key 标识对话、实体和维度，状态值另存，同键不自动互斥。</w:t>
+      </w:r>
+    </w:p>
+    <w:p>
+      <w:r>
+        <w:t>使用 MemoryRelation 保存端点、标签、理由和原文证据，区分 RETAIN、UPDATE、SUPERSEDE、CONFLICT 与未确定。保留旧记忆，才能回答过去时点的问题、追溯演化并复核判断；新证据替代当前取值，也不抹除旧事实的历史意义。时间较新不能单独证明替代。</w:t>
+      </w:r>
+    </w:p>
+    <w:p>
+      <w:r>
+        <w:t>有效证据：召回只说明相关；解析还要按问题的人物、维度和时间选择适用记忆。旧、新记录可能同时有效，也可能因计划尚未发生或时间不符被排除。“现在”指对话最后会话的已知截止时间，未知日期不强行精确化。</w:t>
+      </w:r>
+    </w:p>
+    <w:p>
+      <w:r>
+        <w:t>查询不修改全局状态：历史提问和本次补判是问题范围内的选择，不代表现实发生更新。结论只保存于 QueryTrace；全局关系与可重算 Current State 由构建／显式重建维护，避免答案依赖提问顺序。〔2〕 〔4〕</w:t>
       </w:r>
     </w:p>
     <w:p>
@@ -614,66 +485,177 @@
         <w:pStyle w:val="Heading1"/>
       </w:pPr>
       <w:r>
-        <w:t>3 已实现的核心功能与运行方式</w:t>
-      </w:r>
-    </w:p>
-    <w:p>
-      <w:pPr>
-        <w:pStyle w:val="Heading2"/>
-      </w:pPr>
-      <w:r>
-        <w:t>3.1 可复用的记忆构建</w:t>
+        <w:t>3 已实现功能：一次真实职业探索问答</w:t>
       </w:r>
     </w:p>
     <w:p>
       <w:r>
-        <w:t>导入与来源检查 → 分片抽取 → 来源和结构校验 → 建立索引 → 历史关系判断 → 状态投影 → 完整版本发布。构建阶段保存片段和关系任务的成功、失败及中断结果，显式重试复用成功产物。新版本检查通过后才整体切换；失败保留旧完整版本，首次未完成构建只允许检查。〔4〕</w:t>
+        <w:t>案例 state-01，conv-26，Dynamic；问题：“As of the end of the conversation, what is known about Caroline's career exploration?”（截至对话结束，Caroline 的职业探索有何进展？）</w:t>
+      </w:r>
+    </w:p>
+    <w:tbl>
+      <w:tblPr>
+        <w:tblStyle w:val="TableGrid"/>
+        <w:tblW w:type="auto" w:w="0"/>
+        <w:tblLook w:firstColumn="1" w:firstRow="1" w:lastColumn="0" w:lastRow="0" w:noHBand="0" w:noVBand="1" w:val="04A0"/>
+      </w:tblPr>
+      <w:tblGrid>
+        <w:gridCol w:w="3213"/>
+        <w:gridCol w:w="3213"/>
+        <w:gridCol w:w="3213"/>
+      </w:tblGrid>
+      <w:tr>
+        <w:tc>
+          <w:tcPr>
+            <w:tcW w:type="dxa" w:w="3213"/>
+          </w:tcPr>
+          <w:p>
+            <w:r>
+              <w:t>历史阶段</w:t>
+            </w:r>
+          </w:p>
+        </w:tc>
+        <w:tc>
+          <w:tcPr>
+            <w:tcW w:type="dxa" w:w="3213"/>
+          </w:tcPr>
+          <w:p>
+            <w:r>
+              <w:t>抽取记忆及性质</w:t>
+            </w:r>
+          </w:p>
+        </w:tc>
+        <w:tc>
+          <w:tcPr>
+            <w:tcW w:type="dxa" w:w="3213"/>
+          </w:tcPr>
+          <w:p>
+            <w:r>
+              <w:t>可定位原文</w:t>
+            </w:r>
+          </w:p>
+        </w:tc>
+      </w:tr>
+      <w:tr>
+        <w:tc>
+          <w:tcPr>
+            <w:tcW w:type="dxa" w:w="3213"/>
+          </w:tcPr>
+          <w:p>
+            <w:r>
+              <w:t>D1:9，2023-05-08</w:t>
+            </w:r>
+          </w:p>
+        </w:tc>
+        <w:tc>
+          <w:tcPr>
+            <w:tcW w:type="dxa" w:w="3213"/>
+          </w:tcPr>
+          <w:p>
+            <w:r>
+              <w:t>计划了解职业选项；plan；Memory ab5f9130…</w:t>
+            </w:r>
+          </w:p>
+        </w:tc>
+        <w:tc>
+          <w:tcPr>
+            <w:tcW w:type="dxa" w:w="3213"/>
+          </w:tcPr>
+          <w:p>
+            <w:r>
+              <w:t>“Gonna continue my edu and check out career options”</w:t>
+            </w:r>
+          </w:p>
+        </w:tc>
+      </w:tr>
+      <w:tr>
+        <w:tc>
+          <w:tcPr>
+            <w:tcW w:type="dxa" w:w="3213"/>
+          </w:tcPr>
+          <w:p>
+            <w:r>
+              <w:t>D7:7，2023-07-12</w:t>
+            </w:r>
+          </w:p>
+        </w:tc>
+        <w:tc>
+          <w:tcPr>
+            <w:tcW w:type="dxa" w:w="3213"/>
+          </w:tcPr>
+          <w:p>
+            <w:r>
+              <w:t>已开始探索咨询与心理健康职业；fact；Memory 376676a7…</w:t>
+            </w:r>
+          </w:p>
+        </w:tc>
+        <w:tc>
+          <w:tcPr>
+            <w:tcW w:type="dxa" w:w="3213"/>
+          </w:tcPr>
+          <w:p>
+            <w:r>
+              <w:t>“I started looking into counseling and mental health career options”</w:t>
+            </w:r>
+          </w:p>
+        </w:tc>
+      </w:tr>
+    </w:tbl>
+    <w:p>
+      <w:r>
+        <w:t>关系判断：同一职业探索过程从计划推进到实际行动，记录 UPDATE（关系 581985a7…），而非把旧计划判为错误或删除。有效证据：旧、新端点均进入本次有效集合；工作坊是已发生事件，继续教育仍是计划，不推断已取得职业资格。</w:t>
       </w:r>
     </w:p>
     <w:p>
       <w:r>
-        <w:t>关系区分 RETAIN、UPDATE、SUPERSEDE、CONFLICT 和 undetermined。历史事件与旧状态保留，计划不直接替代事实，时间较新也不能单独证明替代。当前展示复用已发布 conv-26 完整 Build，含 272 条 Memory 和 4,902 条关系；本轮未重新抽取或修改该 Build。〔3〕 〔5〕</w:t>
-      </w:r>
-    </w:p>
-    <w:p>
-      <w:pPr>
-        <w:pStyle w:val="Heading2"/>
-      </w:pPr>
-      <w:r>
-        <w:t>3.2 查询、补查与可解释回答</w:t>
+        <w:t>答案节选：“Caroline is exploring a career in counseling and mental health …”；回答还说明其兴趣、工作坊及继续教育计划，引用包含 D1:9、D7:7 等原文。历史、关系、有效集合和完整答案均可通过本案例机器记录复核，完整原文与解析见证据包。</w:t>
       </w:r>
     </w:p>
     <w:p>
       <w:r>
-        <w:t>固定完整版本 → 问题分析 → BM25／Dense 检索 → RRF 融合 → 有界历史扩展 → 有效证据解析 → 回答与来源。原始问题始终参与检索，默认两路各取 20 条、初始保留 20 条，扩展一跳后总候选上限 60。超预算时记录省略及截断，不声称证据完整。</w:t>
+        <w:drawing>
+          <wp:inline xmlns:a="http://schemas.openxmlformats.org/drawingml/2006/main" xmlns:pic="http://schemas.openxmlformats.org/drawingml/2006/picture">
+            <wp:extent cx="6120000" cy="2239024"/>
+            <wp:docPr id="3" name="Picture 3"/>
+            <wp:cNvGraphicFramePr>
+              <a:graphicFrameLocks noChangeAspect="1"/>
+            </wp:cNvGraphicFramePr>
+            <a:graphic>
+              <a:graphicData uri="http://schemas.openxmlformats.org/drawingml/2006/picture">
+                <pic:pic>
+                  <pic:nvPicPr>
+                    <pic:cNvPr id="0" name="history-and-effective-memory.png"/>
+                    <pic:cNvPicPr/>
+                  </pic:nvPicPr>
+                  <pic:blipFill>
+                    <a:blip r:embed="rId11"/>
+                    <a:srcRect l="5556" t="48636" r="37500" b="24091"/>
+                    <a:stretch>
+                      <a:fillRect/>
+                    </a:stretch>
+                  </pic:blipFill>
+                  <pic:spPr>
+                    <a:xfrm>
+                      <a:off x="0" y="0"/>
+                      <a:ext cx="6120000" cy="2239024"/>
+                    </a:xfrm>
+                    <a:prstGeom prst="rect"/>
+                  </pic:spPr>
+                </pic:pic>
+              </a:graphicData>
+            </a:graphic>
+          </wp:inline>
+        </w:drawing>
       </w:r>
     </w:p>
     <w:p>
       <w:r>
-        <w:t>在线页面提供 Dynamic 与 Dynamic + 原文兜底。后者在证据缺口时至多进行一次有界原文补查并联合解析，原文来自固定 Build 的来源，不产生新 Memory。必要冲突端点和既有支持受到保护；结构化解析失败可走既有原文备用路径，Trace 记录实际执行策略。查询补判不写回全局关系或状态。〔4〕</w:t>
+        <w:t>图 3 职业探索问答页面局部：保存 Trace 的只读回放，显示证据支持状态和答案；完整截图。</w:t>
       </w:r>
     </w:p>
     <w:p>
       <w:r>
-        <w:t>当前默认 deepseek-flash，输出上限 8192 tokens，关系阶段 high 思考、证据解析 low，其余阶段关闭思考。展示实验固定配置中，通用输出上限为 8192，关系阶段单独配置为 16384；设置见 plan.json，构建被复用，本轮未重跑关系。MiniLM 固定 revision、384 维，检查长度并拒绝静默截断。</w:t>
-      </w:r>
-    </w:p>
-    <w:p>
-      <w:pPr>
-        <w:pStyle w:val="Heading2"/>
-      </w:pPr>
-      <w:r>
-        <w:t>3.3 可运行证据与复现入口</w:t>
-      </w:r>
-    </w:p>
-    <w:p>
-      <w:r>
-        <w:t>既有 Chromium 检查已覆盖导入、故意失败与重试、发布、当前／历史／冲突／不足问答及 JSON 下载。真实结果通过生产页面和只读 API 回放保存 Trace，五项操作均通过，页面与控制台错误为零；回放不代表新发起模型请求。〔5〕</w:t>
-      </w:r>
-    </w:p>
-    <w:p>
-      <w:r>
-        <w:t>运行环境为 WSL Ubuntu、Python 3.12 和 uv。锁定安装后，分别启动 FastAPI 与 Streamlit；真实构建另需本地 MiniLM 缓存和受保护凭据。接口包括 POST /builds、POST /queries、GET /queries/{trace_id} 和完整版本导出，详细命令见运行指南。〔4〕</w:t>
+        <w:t>Trace：fb0b30cf8e254441be9d4830319b1634。演示视频：未录制，文件名与案例时间段待补。运行入口为 FastAPI＋Streamlit（WSL、Python 3.12、uv），启动命令见〔4〕。</w:t>
       </w:r>
     </w:p>
     <w:p>
@@ -691,12 +673,17 @@
     </w:p>
     <w:p>
       <w:r>
-        <w:t>合并前已有全量非 live 回归 405 passed、4 skipped，并保存编译和浏览器验证记录。本轮展示执行前相关测试 24 passed；受控浏览器检查退出 0。真实 MiniLM 独立检查已有 3 passed 记录。以上均为仓库既有执行结果，本次文档修订未重跑业务或付费实验。〔5〕 〔6〕</w:t>
+        <w:t>展示验证：2026-10-21，conv-26 开发对话，完整 Build 5c7699dd…（272 条 Memory、4,902 条关系），配置和指纹见 plan.json。生成模型为 deepseek-flash，MiniLM revision 与各阶段设置固定，复用同一 Build。〔3〕 〔5〕</w:t>
       </w:r>
     </w:p>
     <w:p>
       <w:r>
-        <w:t>展示实验固定 conv-26、同一完整 Build，预先分层选取五个类别各 4 题；20 题分别运行五策略，共 100 个逻辑项，全部得到合法结果。F1 按既有官方类别分支计算，仅汇总类别 1–4 的 16 题；类别 5 的 4 题单列拒答匹配，运行成功不等于语义正确。〔5〕</w:t>
+        <w:t>工程验证：已有非 live 回归 405 passed、4 skipped，覆盖导入、恢复、版本、检索、查询和导出；展示前相关测试 24 passed，真实 MiniLM 检查 3 passed。受控浏览器覆盖当前／历史／冲突／不足及评测页面，退出 0；真实 Trace 回放 5 项通过，页面和控制台错误为 0。〔5〕 〔6〕</w:t>
+      </w:r>
+    </w:p>
+    <w:p>
+      <w:r>
+        <w:t>问答样本按五个类别各预选 4 题，同题运行五策略，共 100 项，各策略均成功 20/20。F1 按既有官方类别分支计算，仅汇总类别 1–4 的 16 题；类别 5 的 4 题在表后单列。</w:t>
       </w:r>
     </w:p>
     <w:tbl>
@@ -728,7 +715,7 @@
           </w:tcPr>
           <w:p>
             <w:r>
-              <w:t>可回答题 F1</w:t>
+              <w:t>类别 1–4 F1</w:t>
             </w:r>
           </w:p>
         </w:tc>
@@ -738,7 +725,7 @@
           </w:tcPr>
           <w:p>
             <w:r>
-              <w:t>成功项</w:t>
+              <w:t>输入 tokens／20 题</w:t>
             </w:r>
           </w:p>
         </w:tc>
@@ -748,7 +735,7 @@
           </w:tcPr>
           <w:p>
             <w:r>
-              <w:t>类别 5 拒答匹配</w:t>
+              <w:t>输出 tokens／20 题</w:t>
             </w:r>
           </w:p>
         </w:tc>
@@ -780,7 +767,7 @@
           </w:tcPr>
           <w:p>
             <w:r>
-              <w:t>20/20</w:t>
+              <w:t>1,270,393</w:t>
             </w:r>
           </w:p>
         </w:tc>
@@ -790,7 +777,7 @@
           </w:tcPr>
           <w:p>
             <w:r>
-              <w:t>4/4</w:t>
+              <w:t>2,558</w:t>
             </w:r>
           </w:p>
         </w:tc>
@@ -822,7 +809,7 @@
           </w:tcPr>
           <w:p>
             <w:r>
-              <w:t>20/20</w:t>
+              <w:t>159,789</w:t>
             </w:r>
           </w:p>
         </w:tc>
@@ -832,7 +819,7 @@
           </w:tcPr>
           <w:p>
             <w:r>
-              <w:t>4/4</w:t>
+              <w:t>3,567</w:t>
             </w:r>
           </w:p>
         </w:tc>
@@ -864,7 +851,7 @@
           </w:tcPr>
           <w:p>
             <w:r>
-              <w:t>20/20</w:t>
+              <w:t>168,978</w:t>
             </w:r>
           </w:p>
         </w:tc>
@@ -874,7 +861,7 @@
           </w:tcPr>
           <w:p>
             <w:r>
-              <w:t>4/4</w:t>
+              <w:t>3,473</w:t>
             </w:r>
           </w:p>
         </w:tc>
@@ -906,7 +893,7 @@
           </w:tcPr>
           <w:p>
             <w:r>
-              <w:t>20/20</w:t>
+              <w:t>1,477,136</w:t>
             </w:r>
           </w:p>
         </w:tc>
@@ -916,7 +903,7 @@
           </w:tcPr>
           <w:p>
             <w:r>
-              <w:t>4/4</w:t>
+              <w:t>112,169</w:t>
             </w:r>
           </w:p>
         </w:tc>
@@ -948,7 +935,7 @@
           </w:tcPr>
           <w:p>
             <w:r>
-              <w:t>20/20</w:t>
+              <w:t>341,097</w:t>
             </w:r>
           </w:p>
         </w:tc>
@@ -958,7 +945,7 @@
           </w:tcPr>
           <w:p>
             <w:r>
-              <w:t>4/4</w:t>
+              <w:t>75,900</w:t>
             </w:r>
           </w:p>
         </w:tc>
@@ -966,7 +953,12 @@
     </w:tbl>
     <w:p>
       <w:r>
-        <w:t>Full Text 输入完整对话，检索策略使用各自证据预算，输入量并不相同。Dynamic 有 2 题实际触发结构化失败后的原文备用，因此不能作为禁用备用路径的纯消融。本组 Hybrid 与 Dynamic 接近，原文兜底未总体胜出，单对话单轮不能证明稳定优劣。</w:t>
+        <w:t>类别 5 单列：4 题，各策略按既有拒答规则匹配均为 4/4，不并入 F1。token 为各策略 20 题全部查询尝试的提供方用量，含失败、重试和各阶段，不含复用 Build 的构建。Full Text 输入完整对话，RAG 采用各自证据预算。</w:t>
+      </w:r>
+    </w:p>
+    <w:p>
+      <w:r>
+        <w:t>Dynamic 有 2 题实际触发结构化失败后的原文备用路径，结果按请求策略汇总，并保留实际执行策略；该组不是关闭备用路径的纯动态消融。</w:t>
       </w:r>
     </w:p>
     <w:p>
@@ -1157,7 +1149,12 @@
     </w:tbl>
     <w:p>
       <w:r>
-        <w:t>10 个真实动态查询均成功；开发助手审阅为 9 条回答正确、1 条部分支持，存储关系另有 2 处语义异议。该审阅不是独立动态真值，不作为课程准确率。20 条回答来源审阅均引用合法，但仍有推断及部分支持；引用合法不能代替语义正确。〔5〕</w:t>
+        <w:t>结果分析：Hybrid F1 为 0.5124，Dynamic 为 0.5100；同组查询总 token 分别为 172,451 和 1,589,305，Dynamic 约为 Hybrid 的 9.2 倍。本轮未观察到 Dynamic 的整体优势，需要进一步核查状态变化问题上的收益和额外开销。原文兜底也未总体胜出。</w:t>
+      </w:r>
+    </w:p>
+    <w:p>
+      <w:r>
+        <w:t>当前真实 Build 尚无 SUPERSEDE／CONFLICT，两类真实关系质量未评；合成冲突仅验证处理流程。10 个动态案例作者审阅为 9 条正确、1 条部分支持，存储关系另有 2 处语义异议，未独立复核。单对话单轮展示不能代表跨对话或留出集表现。〔5〕 〔7〕</w:t>
       </w:r>
     </w:p>
     <w:p>
@@ -1170,7 +1167,7 @@
         <w:pStyle w:val="Heading1"/>
       </w:pPr>
       <w:r>
-        <w:t>5 结果分析、未完成项与后续安排</w:t>
+        <w:t>5 问题、后续安排与证据索引</w:t>
       </w:r>
     </w:p>
     <w:p>
@@ -1178,17 +1175,17 @@
         <w:pStyle w:val="Heading2"/>
       </w:pPr>
       <w:r>
-        <w:t>5.1 已观察到的收益与不足</w:t>
+        <w:t>5.1 两个需要处理的真实案例</w:t>
       </w:r>
     </w:p>
     <w:p>
       <w:r>
-        <w:t>QA148 的原文补查从 D18:5 找到家人对 Grand Canyon 的反应，补足原先不足的证据，展示补查的实际作用；但回答较参考长，词面 F1 仅 0.1429。QA51 仍遗漏 sunrise，QA144 答事故结局而非儿子的应对，QA68 的 Seven years 与 Since 2016 表述接近但词面分数为 0。误差同时涉及召回、证据覆盖、回答切题与计分口径，不能一概归因于检索。〔5〕</w:t>
+        <w:t>QA51：枚举画作时遗漏 sunrise，部分分组超出明确文本。已确认答案覆盖不全；遗漏发生在抽取、召回、有效证据选择还是生成，尚待定位。下一步对照 gold 原文、初始／扩展／有效集合及答案，确定缺失阶段后修正，并用固定题复核。〔5〕</w:t>
       </w:r>
     </w:p>
     <w:p>
       <w:r>
-        <w:t>当前真实 Build 没有 SUPERSEDE／CONFLICT，合成冲突场景只能验证处理流程，不能评价这两类真实关系质量。动态案例还有将“未报告完成收养”表达为“确定未完成”的问题；两处关系语义异议也表明合法结构和成功请求不足以证明状态判断正确。</w:t>
+        <w:t>state-02：回答把“现有对话未报告完成收养”表达为“确定尚未完成”。已确认结论强于证据，具体引入阶段待查。下一步对照 Trace 定位越界处，校正证据不足与否定事实的表达边界，并加入有／无明确完成证据的成对检查。〔7〕</w:t>
       </w:r>
     </w:p>
     <w:p>
@@ -1196,22 +1193,111 @@
         <w:pStyle w:val="Heading2"/>
       </w:pPr>
       <w:r>
-        <w:t>5.2 阶段范围与待完成工作</w:t>
+        <w:t>5.2 尚未完成的评价与下一步</w:t>
       </w:r>
     </w:p>
+    <w:tbl>
+      <w:tblPr>
+        <w:tblStyle w:val="TableGrid"/>
+        <w:tblW w:type="auto" w:w="0"/>
+        <w:tblLook w:firstColumn="1" w:firstRow="1" w:lastColumn="0" w:lastRow="0" w:noHBand="0" w:noVBand="1" w:val="04A0"/>
+      </w:tblPr>
+      <w:tblGrid>
+        <w:gridCol w:w="4819"/>
+        <w:gridCol w:w="4819"/>
+      </w:tblGrid>
+      <w:tr>
+        <w:tc>
+          <w:tcPr>
+            <w:tcW w:type="dxa" w:w="4819"/>
+          </w:tcPr>
+          <w:p>
+            <w:r>
+              <w:t>未完成项</w:t>
+            </w:r>
+          </w:p>
+        </w:tc>
+        <w:tc>
+          <w:tcPr>
+            <w:tcW w:type="dxa" w:w="4819"/>
+          </w:tcPr>
+          <w:p>
+            <w:r>
+              <w:t>下一步与证据</w:t>
+            </w:r>
+          </w:p>
+        </w:tc>
+      </w:tr>
+      <w:tr>
+        <w:tc>
+          <w:tcPr>
+            <w:tcW w:type="dxa" w:w="4819"/>
+          </w:tcPr>
+          <w:p>
+            <w:r>
+              <w:t>留出集测试</w:t>
+            </w:r>
+          </w:p>
+        </w:tc>
+        <w:tc>
+          <w:tcPr>
+            <w:tcW w:type="dxa" w:w="4819"/>
+          </w:tcPr>
+          <w:p>
+            <w:r>
+              <w:t>尚未完成；冻结实现、题单和预算后，在 conv-43/44 测试并单列结果，不用留出成绩调参</w:t>
+            </w:r>
+          </w:p>
+        </w:tc>
+      </w:tr>
+      <w:tr>
+        <w:tc>
+          <w:tcPr>
+            <w:tcW w:type="dxa" w:w="4819"/>
+          </w:tcPr>
+          <w:p>
+            <w:r>
+              <w:t>跨对话评测</w:t>
+            </w:r>
+          </w:p>
+        </w:tc>
+        <w:tc>
+          <w:tcPr>
+            <w:tcW w:type="dxa" w:w="4819"/>
+          </w:tcPr>
+          <w:p>
+            <w:r>
+              <w:t>尚未完成；先在 conv-30/41/42 固定少量同类状态问题，按对话比较回答、证据覆盖与 token</w:t>
+            </w:r>
+          </w:p>
+        </w:tc>
+      </w:tr>
+      <w:tr>
+        <w:tc>
+          <w:tcPr>
+            <w:tcW w:type="dxa" w:w="4819"/>
+          </w:tcPr>
+          <w:p>
+            <w:r>
+              <w:t>独立动态质量评价</w:t>
+            </w:r>
+          </w:p>
+        </w:tc>
+        <w:tc>
+          <w:tcPr>
+            <w:tcW w:type="dxa" w:w="4819"/>
+          </w:tcPr>
+          <w:p>
+            <w:r>
+              <w:t>未独立复核；需取得独立核查的关系与有效证据判断，再评价状态变化子集；优先保留并核查现有异议</w:t>
+            </w:r>
+          </w:p>
+        </w:tc>
+      </w:tr>
+    </w:tbl>
     <w:p>
       <w:r>
-        <w:t>本轮完成的是限定范围的开发集展示及证据审阅。原 Issue #15 已被后续增量迭代取代，757 题、四策略 3,028 项全量实验取消，Issue #20 原固定预检延期。本轮 100 项展示不替代原全量验收，也不恢复已取消计划；本地留出对话和教师隐藏评分集尚无本轮结果。〔2〕 〔7〕</w:t>
-      </w:r>
-    </w:p>
-    <w:p>
-      <w:r>
-        <w:t>后续优先修正枚举遗漏、时间表达与回答切题问题，结合来源逐例分析；取得独立核查的动态标注后再评价关系及有效记忆，保留未评类别。扩大实验需重新固定范围、配置和预算，开发与留出数据隔离。图谱、多跳等扩展继续排在核心质量验证之后。</w:t>
-      </w:r>
-    </w:p>
-    <w:p>
-      <w:r>
-        <w:t>中期已有可运行的核心系统、真实问答对照、来源检索和页面验证证据。展示时应演示从原始来源到记忆、有效证据及回答的链路，并如实解释失败与不足。本文为待复核稿，成员非作者复核、展示环境复测和正式提交仍按 Team Workflow 执行。</w:t>
+        <w:t>下一阶段先完成现有失败案例定位，再按固定范围逐步推进上述评价。中期报告呈现当前成果与初步结果。</w:t>
       </w:r>
     </w:p>
     <w:p>
@@ -1224,7 +1310,7 @@
     </w:p>
     <w:p>
       <w:r>
-        <w:t>〔1〕 正式 M3 需求规格说明书：待填写；Issue #4 实现规格历史副本供参考。</w:t>
+        <w:t>〔1〕 M3 需求规格说明书 v0.3（2026-10-22，待团队复核）；Issue #4 实现规格历史副本供参考。</w:t>
       </w:r>
     </w:p>
     <w:p>
@@ -1254,7 +1340,7 @@
     </w:p>
     <w:p>
       <w:r>
-        <w:t>〔7〕 原全量范围结案；文档变更与页数校验另见本轮记录。</w:t>
+        <w:t>〔7〕 动态案例及已有异议、关系与有效证据记录。</w:t>
       </w:r>
     </w:p>
     <w:sectPr>

</xml_diff>